<commit_message>
maintenance app for cyberpanel
</commit_message>
<xml_diff>
--- a/ReadyRentals_Client_Handover.docx
+++ b/ReadyRentals_Client_Handover.docx
@@ -1,6 +1,6 @@
 
 <file path=word/document.xml><?xml version="1.0" encoding="utf-8"?>
-<w:document xmlns:w="http://schemas.openxmlformats.org/wordprocessingml/2006/main" xmlns:r="http://schemas.openxmlformats.org/officeDocument/2006/relationships" xmlns:wp="http://schemas.openxmlformats.org/drawingml/2006/wordprocessingDrawing" xmlns:a="http://schemas.openxmlformats.org/drawingml/2006/main" xmlns:pic="http://schemas.openxmlformats.org/drawingml/2006/picture">
+<w:document xmlns:a="http://schemas.openxmlformats.org/drawingml/2006/main" xmlns:pic="http://schemas.openxmlformats.org/drawingml/2006/picture" xmlns:r="http://schemas.openxmlformats.org/officeDocument/2006/relationships" xmlns:w="http://schemas.openxmlformats.org/wordprocessingml/2006/main" xmlns:wp="http://schemas.openxmlformats.org/drawingml/2006/wordprocessingDrawing">
   <w:body>
     <w:p>
       <w:pPr>
@@ -131,7 +131,7 @@
               <w:rPr>
                 <w:color w:val="243447"/>
               </w:rPr>
-              <w:t xml:space="preserve">1.1</w:t>
+              <w:t xml:space="preserve">1.2</w:t>
             </w:r>
           </w:p>
         </w:tc>
@@ -865,7 +865,7 @@
               <w:rPr>
                 <w:color w:val="243447"/>
               </w:rPr>
-              <w:t xml:space="preserve">SMTP for completion reports; optional Twilio for worker links.</w:t>
+              <w:t xml:space="preserve">Optional technician assignment email and Twilio SMS; signed PDF emailed to the work-order creator with Owner copies.</w:t>
             </w:r>
           </w:p>
         </w:tc>
@@ -903,7 +903,45 @@
               <w:rPr>
                 <w:color w:val="243447"/>
               </w:rPr>
-              <w:t xml:space="preserve">Owner and Admin. Existing legacy Manager-role records migrate to Admin.</w:t>
+              <w:t xml:space="preserve">Owner and Admin. Owners manage Admin accounts and audit logs; legacy Manager records migrate to Admin.</w:t>
+            </w:r>
+          </w:p>
+        </w:tc>
+      </w:tr>
+      <w:tr>
+        <w:tc>
+          <w:tcPr>
+            <w:tcW w:w="2200" w:type="dxa"/>
+            <w:shd w:fill="F6F9FB"/>
+            <w:vAlign w:val="center"/>
+          </w:tcPr>
+          <w:p>
+            <w:pPr>
+              <w:pStyle w:val="TableText"/>
+            </w:pPr>
+            <w:r>
+              <w:rPr>
+                <w:color w:val="243447"/>
+              </w:rPr>
+              <w:t xml:space="preserve">Priority targets</w:t>
+            </w:r>
+          </w:p>
+        </w:tc>
+        <w:tc>
+          <w:tcPr>
+            <w:tcW w:w="7880" w:type="dxa"/>
+            <w:shd w:fill="F6F9FB"/>
+            <w:vAlign w:val="center"/>
+          </w:tcPr>
+          <w:p>
+            <w:pPr>
+              <w:pStyle w:val="TableText"/>
+            </w:pPr>
+            <w:r>
+              <w:rPr>
+                <w:color w:val="243447"/>
+              </w:rPr>
+              <w:t xml:space="preserve">Emergency 4 hours; urgent 24 hours; standard 72 hours. Targets are stored in the priorities lookup table.</w:t>
             </w:r>
           </w:p>
         </w:tc>
@@ -1837,7 +1875,7 @@
               <w:rPr>
                 <w:color w:val="243447"/>
               </w:rPr>
-              <w:t xml:space="preserve">Completion checks passed and tenant sign-off is pending/recorded before technician sign-off.</w:t>
+              <w:t xml:space="preserve">Completion checks passed; tenant signs first, then technician. Both signatures finalize the order.</w:t>
             </w:r>
           </w:p>
         </w:tc>
@@ -1875,7 +1913,7 @@
               <w:rPr>
                 <w:color w:val="243447"/>
               </w:rPr>
-              <w:t xml:space="preserve">Finalized, PDF generated, and write-locked; Owner-only work-order deletion is permitted.</w:t>
+              <w:t xml:space="preserve">Finalized PDF is stored; completion email is queued to the creator with Owner copies; writes are locked. Only Owner may delete.</w:t>
             </w:r>
           </w:p>
         </w:tc>
@@ -4099,6 +4137,82 @@
           </w:p>
         </w:tc>
       </w:tr>
+      <w:tr>
+        <w:tc>
+          <w:tcPr>
+            <w:tcW w:w="3100" w:type="dxa"/>
+            <w:shd w:fill="F6F9FB"/>
+            <w:vAlign w:val="center"/>
+          </w:tcPr>
+          <w:p>
+            <w:pPr>
+              <w:pStyle w:val="TableText"/>
+            </w:pPr>
+            <w:r>
+              <w:rPr>
+                <w:color w:val="243447"/>
+              </w:rPr>
+              <w:t xml:space="preserve">FRONTEND_BASE_URL</w:t>
+            </w:r>
+          </w:p>
+        </w:tc>
+        <w:tc>
+          <w:tcPr>
+            <w:tcW w:w="6980" w:type="dxa"/>
+            <w:shd w:fill="F6F9FB"/>
+            <w:vAlign w:val="center"/>
+          </w:tcPr>
+          <w:p>
+            <w:pPr>
+              <w:pStyle w:val="TableText"/>
+            </w:pPr>
+            <w:r>
+              <w:rPr>
+                <w:color w:val="243447"/>
+              </w:rPr>
+              <w:t xml:space="preserve">Frontend origin used to build technician/tenant links; Compose sets it from DOMAIN.</w:t>
+            </w:r>
+          </w:p>
+        </w:tc>
+      </w:tr>
+      <w:tr>
+        <w:tc>
+          <w:tcPr>
+            <w:tcW w:w="3100" w:type="dxa"/>
+            <w:shd w:fill="F6F9FB"/>
+            <w:vAlign w:val="center"/>
+          </w:tcPr>
+          <w:p>
+            <w:pPr>
+              <w:pStyle w:val="TableText"/>
+            </w:pPr>
+            <w:r>
+              <w:rPr>
+                <w:color w:val="243447"/>
+              </w:rPr>
+              <w:t xml:space="preserve">CORS_ORIGINS</w:t>
+            </w:r>
+          </w:p>
+        </w:tc>
+        <w:tc>
+          <w:tcPr>
+            <w:tcW w:w="6980" w:type="dxa"/>
+            <w:shd w:fill="F6F9FB"/>
+            <w:vAlign w:val="center"/>
+          </w:tcPr>
+          <w:p>
+            <w:pPr>
+              <w:pStyle w:val="TableText"/>
+            </w:pPr>
+            <w:r>
+              <w:rPr>
+                <w:color w:val="243447"/>
+              </w:rPr>
+              <w:t xml:space="preserve">Comma-separated allowed browser origins. Production Compose sets the app HTTPS origin; keep it explicit.</w:t>
+            </w:r>
+          </w:p>
+        </w:tc>
+      </w:tr>
     </w:tbl>
     <w:p>
       <w:pPr>
@@ -4235,61 +4349,79 @@
         <w:pStyle w:val="Code"/>
       </w:pPr>
       <w:r>
-        <w:t xml:space="preserve">sudo mkdir -p /opt/readyrentals</w:t>
-      </w:r>
-      <w:r>
-        <w:br/>
-      </w:r>
-      <w:r>
-        <w:t xml:space="preserve">sudo chown "$(id -u):$(id -g)" /opt/readyrentals</w:t>
-      </w:r>
-      <w:r>
-        <w:br/>
-      </w:r>
-      <w:r>
-        <w:t xml:space="preserve"># Copy/clone the reviewed project into /opt/readyrentals</w:t>
-      </w:r>
-      <w:r>
-        <w:br/>
-      </w:r>
-      <w:r>
-        <w:t xml:space="preserve">cd /opt/readyrentals</w:t>
-      </w:r>
-      <w:r>
-        <w:br/>
-      </w:r>
-      <w:r>
-        <w:t xml:space="preserve">cp .env.production.example .env.production</w:t>
-      </w:r>
-      <w:r>
-        <w:br/>
-      </w:r>
-      <w:r>
-        <w:t xml:space="preserve">nano .env.production</w:t>
-      </w:r>
-      <w:r>
-        <w:br/>
-      </w:r>
-      <w:r>
-        <w:t xml:space="preserve">chmod 600 .env.production</w:t>
-      </w:r>
-      <w:r>
-        <w:br/>
-      </w:r>
-      <w:r>
-        <w:t xml:space="preserve">docker compose --env-file .env.production -f compose.production.yaml config --quiet</w:t>
-      </w:r>
-      <w:r>
-        <w:br/>
-      </w:r>
-      <w:r>
-        <w:t xml:space="preserve">docker compose --env-file .env.production -f compose.production.yaml up -d --build</w:t>
-      </w:r>
-      <w:r>
-        <w:br/>
-      </w:r>
-      <w:r>
-        <w:t xml:space="preserve">docker compose --env-file .env.production -f compose.production.yaml ps</w:t>
+        <w:t>sudo mkdir -p /opt/readyrentals</w:t>
+      </w:r>
+    </w:p>
+    <w:p>
+      <w:pPr>
+        <w:pStyle w:val="Code"/>
+      </w:pPr>
+      <w:r>
+        <w:t>sudo chown "$(id -u):$(id -g)" /opt/readyrentals</w:t>
+      </w:r>
+    </w:p>
+    <w:p>
+      <w:pPr>
+        <w:pStyle w:val="Code"/>
+      </w:pPr>
+      <w:r>
+        <w:t># Copy or clone the reviewed project into /opt/readyrentals</w:t>
+      </w:r>
+    </w:p>
+    <w:p>
+      <w:pPr>
+        <w:pStyle w:val="Code"/>
+      </w:pPr>
+      <w:r>
+        <w:t>cd /opt/readyrentals</w:t>
+      </w:r>
+    </w:p>
+    <w:p>
+      <w:pPr>
+        <w:pStyle w:val="Code"/>
+      </w:pPr>
+      <w:r>
+        <w:t>cp .env.production.example .env.production</w:t>
+      </w:r>
+    </w:p>
+    <w:p>
+      <w:pPr>
+        <w:pStyle w:val="Code"/>
+      </w:pPr>
+      <w:r>
+        <w:t>nano .env.production</w:t>
+      </w:r>
+    </w:p>
+    <w:p>
+      <w:pPr>
+        <w:pStyle w:val="Code"/>
+      </w:pPr>
+      <w:r>
+        <w:t>chmod 600 .env.production</w:t>
+      </w:r>
+    </w:p>
+    <w:p>
+      <w:pPr>
+        <w:pStyle w:val="Code"/>
+      </w:pPr>
+      <w:r>
+        <w:t>docker compose --env-file .env.production -f compose.production.yaml config --quiet</w:t>
+      </w:r>
+    </w:p>
+    <w:p>
+      <w:pPr>
+        <w:pStyle w:val="Code"/>
+      </w:pPr>
+      <w:r>
+        <w:t>docker compose --env-file .env.production -f compose.production.yaml up -d --build</w:t>
+      </w:r>
+    </w:p>
+    <w:p>
+      <w:pPr>
+        <w:pStyle w:val="Code"/>
+      </w:pPr>
+      <w:r>
+        <w:t>docker compose --env-file .env.production -f compose.production.yaml ps</w:t>
       </w:r>
     </w:p>
     <w:p>
@@ -4370,31 +4502,39 @@
         <w:pStyle w:val="Code"/>
       </w:pPr>
       <w:r>
-        <w:t xml:space="preserve">cd /opt/readyrentals</w:t>
-      </w:r>
-      <w:r>
-        <w:br/>
-      </w:r>
-      <w:r>
-        <w:t xml:space="preserve">git pull</w:t>
-      </w:r>
-      <w:r>
-        <w:br/>
-      </w:r>
-      <w:r>
-        <w:t xml:space="preserve">docker compose --env-file .env.production -f compose.production.yaml config --quiet</w:t>
-      </w:r>
-      <w:r>
-        <w:br/>
-      </w:r>
-      <w:r>
-        <w:t xml:space="preserve">docker compose --env-file .env.production -f compose.production.yaml up -d --build</w:t>
-      </w:r>
-      <w:r>
-        <w:br/>
-      </w:r>
-      <w:r>
-        <w:t xml:space="preserve">docker compose --env-file .env.production -f compose.production.yaml ps</w:t>
+        <w:t>cd /opt/readyrentals</w:t>
+      </w:r>
+    </w:p>
+    <w:p>
+      <w:pPr>
+        <w:pStyle w:val="Code"/>
+      </w:pPr>
+      <w:r>
+        <w:t>git pull</w:t>
+      </w:r>
+    </w:p>
+    <w:p>
+      <w:pPr>
+        <w:pStyle w:val="Code"/>
+      </w:pPr>
+      <w:r>
+        <w:t>docker compose --env-file .env.production -f compose.production.yaml config --quiet</w:t>
+      </w:r>
+    </w:p>
+    <w:p>
+      <w:pPr>
+        <w:pStyle w:val="Code"/>
+      </w:pPr>
+      <w:r>
+        <w:t>docker compose --env-file .env.production -f compose.production.yaml up -d --build</w:t>
+      </w:r>
+    </w:p>
+    <w:p>
+      <w:pPr>
+        <w:pStyle w:val="Code"/>
+      </w:pPr>
+      <w:r>
+        <w:t>docker compose --env-file .env.production -f compose.production.yaml ps</w:t>
       </w:r>
     </w:p>
     <w:p>
@@ -5075,6 +5215,44 @@
                 <w:color w:val="243447"/>
               </w:rPr>
               <w:t xml:space="preserve">Startup/migration logs, DB health, required env values, and migration compatibility before rollback.</w:t>
+            </w:r>
+          </w:p>
+        </w:tc>
+      </w:tr>
+      <w:tr>
+        <w:tc>
+          <w:tcPr>
+            <w:tcW w:w="2200" w:type="dxa"/>
+            <w:shd w:fill="F6F9FB"/>
+            <w:vAlign w:val="center"/>
+          </w:tcPr>
+          <w:p>
+            <w:pPr>
+              <w:pStyle w:val="TableText"/>
+            </w:pPr>
+            <w:r>
+              <w:rPr>
+                <w:color w:val="243447"/>
+              </w:rPr>
+              <w:t xml:space="preserve">Technician assignment email missing</w:t>
+            </w:r>
+          </w:p>
+        </w:tc>
+        <w:tc>
+          <w:tcPr>
+            <w:tcW w:w="7880" w:type="dxa"/>
+            <w:shd w:fill="F6F9FB"/>
+            <w:vAlign w:val="center"/>
+          </w:tcPr>
+          <w:p>
+            <w:pPr>
+              <w:pStyle w:val="TableText"/>
+            </w:pPr>
+            <w:r>
+              <w:rPr>
+                <w:color w:val="243447"/>
+              </w:rPr>
+              <w:t xml:space="preserve">Check assigned technician email, EMAIL_BACKEND, SMTP/SendGrid settings, sender policy, and API logs.</w:t>
             </w:r>
           </w:p>
         </w:tc>
@@ -5216,31 +5394,39 @@
         <w:pStyle w:val="Code"/>
       </w:pPr>
       <w:r>
-        <w:t xml:space="preserve">install -m 0644 ops/readyrentals-backup.service /etc/systemd/system/</w:t>
-      </w:r>
-      <w:r>
-        <w:br/>
-      </w:r>
-      <w:r>
-        <w:t xml:space="preserve">install -m 0644 ops/readyrentals-backup.timer /etc/systemd/system/</w:t>
-      </w:r>
-      <w:r>
-        <w:br/>
-      </w:r>
-      <w:r>
-        <w:t xml:space="preserve">systemctl daemon-reload</w:t>
-      </w:r>
-      <w:r>
-        <w:br/>
-      </w:r>
-      <w:r>
-        <w:t xml:space="preserve">systemctl enable --now readyrentals-backup.timer</w:t>
-      </w:r>
-      <w:r>
-        <w:br/>
-      </w:r>
-      <w:r>
-        <w:t xml:space="preserve">systemctl list-timers readyrentals-backup.timer</w:t>
+        <w:t>install -m 0644 ops/readyrentals-backup.service /etc/systemd/system/</w:t>
+      </w:r>
+    </w:p>
+    <w:p>
+      <w:pPr>
+        <w:pStyle w:val="Code"/>
+      </w:pPr>
+      <w:r>
+        <w:t>install -m 0644 ops/readyrentals-backup.timer /etc/systemd/system/</w:t>
+      </w:r>
+    </w:p>
+    <w:p>
+      <w:pPr>
+        <w:pStyle w:val="Code"/>
+      </w:pPr>
+      <w:r>
+        <w:t>systemctl daemon-reload</w:t>
+      </w:r>
+    </w:p>
+    <w:p>
+      <w:pPr>
+        <w:pStyle w:val="Code"/>
+      </w:pPr>
+      <w:r>
+        <w:t>systemctl enable --now readyrentals-backup.timer</w:t>
+      </w:r>
+    </w:p>
+    <w:p>
+      <w:pPr>
+        <w:pStyle w:val="Code"/>
+      </w:pPr>
+      <w:r>
+        <w:t>systemctl list-timers readyrentals-backup.timer</w:t>
       </w:r>
     </w:p>
     <w:p>
@@ -5959,7 +6145,7 @@
               <w:rPr>
                 <w:color w:val="243447"/>
               </w:rPr>
-              <w:t xml:space="preserve">Office account login and JWT</w:t>
+              <w:t xml:space="preserve">Sign in and receive an office JWT.</w:t>
             </w:r>
           </w:p>
         </w:tc>
@@ -5986,7 +6172,7 @@
         <w:tc>
           <w:tcPr>
             <w:tcW w:w="3100" w:type="dxa"/>
-            <w:shd w:fill="FFFFFF"/>
+            <w:shd w:fill="F6F9FB"/>
             <w:vAlign w:val="center"/>
           </w:tcPr>
           <w:p>
@@ -6004,25 +6190,25 @@
         <w:tc>
           <w:tcPr>
             <w:tcW w:w="5100" w:type="dxa"/>
-            <w:shd w:fill="FFFFFF"/>
-            <w:vAlign w:val="center"/>
-          </w:tcPr>
-          <w:p>
-            <w:pPr>
-              <w:pStyle w:val="TableText"/>
-            </w:pPr>
-            <w:r>
-              <w:rPr>
-                <w:color w:val="243447"/>
-              </w:rPr>
-              <w:t xml:space="preserve">Initial Owner registration/claim using OWNER_CODE</w:t>
+            <w:shd w:fill="F6F9FB"/>
+            <w:vAlign w:val="center"/>
+          </w:tcPr>
+          <w:p>
+            <w:pPr>
+              <w:pStyle w:val="TableText"/>
+            </w:pPr>
+            <w:r>
+              <w:rPr>
+                <w:color w:val="243447"/>
+              </w:rPr>
+              <w:t xml:space="preserve">Register or claim the initial Owner account using OWNER_CODE.</w:t>
             </w:r>
           </w:p>
         </w:tc>
         <w:tc>
           <w:tcPr>
             <w:tcW w:w="1880" w:type="dxa"/>
-            <w:shd w:fill="FFFFFF"/>
+            <w:shd w:fill="F6F9FB"/>
             <w:vAlign w:val="center"/>
           </w:tcPr>
           <w:p>
@@ -6071,7 +6257,7 @@
               <w:rPr>
                 <w:color w:val="243447"/>
               </w:rPr>
-              <w:t xml:space="preserve">Current account identity and role</w:t>
+              <w:t xml:space="preserve">Read the current office account.</w:t>
             </w:r>
           </w:p>
         </w:tc>
@@ -6089,7 +6275,7 @@
               <w:rPr>
                 <w:color w:val="243447"/>
               </w:rPr>
-              <w:t xml:space="preserve">JWT</w:t>
+              <w:t xml:space="preserve">Office JWT</w:t>
             </w:r>
           </w:p>
         </w:tc>
@@ -6098,54 +6284,54 @@
         <w:tc>
           <w:tcPr>
             <w:tcW w:w="3100" w:type="dxa"/>
-            <w:shd w:fill="FFFFFF"/>
-            <w:vAlign w:val="center"/>
-          </w:tcPr>
-          <w:p>
-            <w:pPr>
-              <w:pStyle w:val="TableText"/>
-            </w:pPr>
-            <w:r>
-              <w:rPr>
-                <w:color w:val="243447"/>
-              </w:rPr>
-              <w:t xml:space="preserve">GET/POST/DELETE /admins</w:t>
+            <w:shd w:fill="F6F9FB"/>
+            <w:vAlign w:val="center"/>
+          </w:tcPr>
+          <w:p>
+            <w:pPr>
+              <w:pStyle w:val="TableText"/>
+            </w:pPr>
+            <w:r>
+              <w:rPr>
+                <w:color w:val="243447"/>
+              </w:rPr>
+              <w:t xml:space="preserve">GET /admins</w:t>
             </w:r>
           </w:p>
         </w:tc>
         <w:tc>
           <w:tcPr>
             <w:tcW w:w="5100" w:type="dxa"/>
-            <w:shd w:fill="FFFFFF"/>
-            <w:vAlign w:val="center"/>
-          </w:tcPr>
-          <w:p>
-            <w:pPr>
-              <w:pStyle w:val="TableText"/>
-            </w:pPr>
-            <w:r>
-              <w:rPr>
-                <w:color w:val="243447"/>
-              </w:rPr>
-              <w:t xml:space="preserve">List/create/remove office Admin accounts</w:t>
+            <w:shd w:fill="F6F9FB"/>
+            <w:vAlign w:val="center"/>
+          </w:tcPr>
+          <w:p>
+            <w:pPr>
+              <w:pStyle w:val="TableText"/>
+            </w:pPr>
+            <w:r>
+              <w:rPr>
+                <w:color w:val="243447"/>
+              </w:rPr>
+              <w:t xml:space="preserve">List office accounts.</w:t>
             </w:r>
           </w:p>
         </w:tc>
         <w:tc>
           <w:tcPr>
             <w:tcW w:w="1880" w:type="dxa"/>
-            <w:shd w:fill="FFFFFF"/>
-            <w:vAlign w:val="center"/>
-          </w:tcPr>
-          <w:p>
-            <w:pPr>
-              <w:pStyle w:val="TableText"/>
-            </w:pPr>
-            <w:r>
-              <w:rPr>
-                <w:color w:val="243447"/>
-              </w:rPr>
-              <w:t xml:space="preserve">Owner only</w:t>
+            <w:shd w:fill="F6F9FB"/>
+            <w:vAlign w:val="center"/>
+          </w:tcPr>
+          <w:p>
+            <w:pPr>
+              <w:pStyle w:val="TableText"/>
+            </w:pPr>
+            <w:r>
+              <w:rPr>
+                <w:color w:val="243447"/>
+              </w:rPr>
+              <w:t xml:space="preserve">Owner JWT</w:t>
             </w:r>
           </w:p>
         </w:tc>
@@ -6165,7 +6351,7 @@
               <w:rPr>
                 <w:color w:val="243447"/>
               </w:rPr>
-              <w:t xml:space="preserve">GET /audit-logs, /audit-logs/stats</w:t>
+              <w:t xml:space="preserve">POST /admins</w:t>
             </w:r>
           </w:p>
         </w:tc>
@@ -6183,7 +6369,7 @@
               <w:rPr>
                 <w:color w:val="243447"/>
               </w:rPr>
-              <w:t xml:space="preserve">Audit events and aggregate activity</w:t>
+              <w:t xml:space="preserve">Create an Admin account.</w:t>
             </w:r>
           </w:p>
         </w:tc>
@@ -6201,7 +6387,7 @@
               <w:rPr>
                 <w:color w:val="243447"/>
               </w:rPr>
-              <w:t xml:space="preserve">Owner only</w:t>
+              <w:t xml:space="preserve">Owner JWT</w:t>
             </w:r>
           </w:p>
         </w:tc>
@@ -6210,54 +6396,54 @@
         <w:tc>
           <w:tcPr>
             <w:tcW w:w="3100" w:type="dxa"/>
-            <w:shd w:fill="FFFFFF"/>
-            <w:vAlign w:val="center"/>
-          </w:tcPr>
-          <w:p>
-            <w:pPr>
-              <w:pStyle w:val="TableText"/>
-            </w:pPr>
-            <w:r>
-              <w:rPr>
-                <w:color w:val="243447"/>
-              </w:rPr>
-              <w:t xml:space="preserve">/work-orders</w:t>
+            <w:shd w:fill="F6F9FB"/>
+            <w:vAlign w:val="center"/>
+          </w:tcPr>
+          <w:p>
+            <w:pPr>
+              <w:pStyle w:val="TableText"/>
+            </w:pPr>
+            <w:r>
+              <w:rPr>
+                <w:color w:val="243447"/>
+              </w:rPr>
+              <w:t xml:space="preserve">DELETE /admins/{admin_id}</w:t>
             </w:r>
           </w:p>
         </w:tc>
         <w:tc>
           <w:tcPr>
             <w:tcW w:w="5100" w:type="dxa"/>
-            <w:shd w:fill="FFFFFF"/>
-            <w:vAlign w:val="center"/>
-          </w:tcPr>
-          <w:p>
-            <w:pPr>
-              <w:pStyle w:val="TableText"/>
-            </w:pPr>
-            <w:r>
-              <w:rPr>
-                <w:color w:val="243447"/>
-              </w:rPr>
-              <w:t xml:space="preserve">Create, list, read, patch, delete, PDF, share/resend, email report</w:t>
+            <w:shd w:fill="F6F9FB"/>
+            <w:vAlign w:val="center"/>
+          </w:tcPr>
+          <w:p>
+            <w:pPr>
+              <w:pStyle w:val="TableText"/>
+            </w:pPr>
+            <w:r>
+              <w:rPr>
+                <w:color w:val="243447"/>
+              </w:rPr>
+              <w:t xml:space="preserve">Remove an Admin; reassign their created orders to Owner.</w:t>
             </w:r>
           </w:p>
         </w:tc>
         <w:tc>
           <w:tcPr>
             <w:tcW w:w="1880" w:type="dxa"/>
-            <w:shd w:fill="FFFFFF"/>
-            <w:vAlign w:val="center"/>
-          </w:tcPr>
-          <w:p>
-            <w:pPr>
-              <w:pStyle w:val="TableText"/>
-            </w:pPr>
-            <w:r>
-              <w:rPr>
-                <w:color w:val="243447"/>
-              </w:rPr>
-              <w:t xml:space="preserve">Owner/Admin JWT</w:t>
+            <w:shd w:fill="F6F9FB"/>
+            <w:vAlign w:val="center"/>
+          </w:tcPr>
+          <w:p>
+            <w:pPr>
+              <w:pStyle w:val="TableText"/>
+            </w:pPr>
+            <w:r>
+              <w:rPr>
+                <w:color w:val="243447"/>
+              </w:rPr>
+              <w:t xml:space="preserve">Owner JWT</w:t>
             </w:r>
           </w:p>
         </w:tc>
@@ -6277,7 +6463,7 @@
               <w:rPr>
                 <w:color w:val="243447"/>
               </w:rPr>
-              <w:t xml:space="preserve">/checklist-categories</w:t>
+              <w:t xml:space="preserve">GET /audit-logs</w:t>
             </w:r>
           </w:p>
         </w:tc>
@@ -6295,7 +6481,7 @@
               <w:rPr>
                 <w:color w:val="243447"/>
               </w:rPr>
-              <w:t xml:space="preserve">List/create/archive categories</w:t>
+              <w:t xml:space="preserve">Search and paginate audit events.</w:t>
             </w:r>
           </w:p>
         </w:tc>
@@ -6313,7 +6499,7 @@
               <w:rPr>
                 <w:color w:val="243447"/>
               </w:rPr>
-              <w:t xml:space="preserve">Owner/Admin JWT</w:t>
+              <w:t xml:space="preserve">Owner JWT</w:t>
             </w:r>
           </w:p>
         </w:tc>
@@ -6322,54 +6508,54 @@
         <w:tc>
           <w:tcPr>
             <w:tcW w:w="3100" w:type="dxa"/>
-            <w:shd w:fill="FFFFFF"/>
-            <w:vAlign w:val="center"/>
-          </w:tcPr>
-          <w:p>
-            <w:pPr>
-              <w:pStyle w:val="TableText"/>
-            </w:pPr>
-            <w:r>
-              <w:rPr>
-                <w:color w:val="243447"/>
-              </w:rPr>
-              <w:t xml:space="preserve">/wo/{token}/*</w:t>
+            <w:shd w:fill="F6F9FB"/>
+            <w:vAlign w:val="center"/>
+          </w:tcPr>
+          <w:p>
+            <w:pPr>
+              <w:pStyle w:val="TableText"/>
+            </w:pPr>
+            <w:r>
+              <w:rPr>
+                <w:color w:val="243447"/>
+              </w:rPr>
+              <w:t xml:space="preserve">GET /audit-logs/stats</w:t>
             </w:r>
           </w:p>
         </w:tc>
         <w:tc>
           <w:tcPr>
             <w:tcW w:w="5100" w:type="dxa"/>
-            <w:shd w:fill="FFFFFF"/>
-            <w:vAlign w:val="center"/>
-          </w:tcPr>
-          <w:p>
-            <w:pPr>
-              <w:pStyle w:val="TableText"/>
-            </w:pPr>
-            <w:r>
-              <w:rPr>
-                <w:color w:val="243447"/>
-              </w:rPr>
-              <w:t xml:space="preserve">Worker start, task update, photos, progress, completion, signatures, PDF</w:t>
+            <w:shd w:fill="F6F9FB"/>
+            <w:vAlign w:val="center"/>
+          </w:tcPr>
+          <w:p>
+            <w:pPr>
+              <w:pStyle w:val="TableText"/>
+            </w:pPr>
+            <w:r>
+              <w:rPr>
+                <w:color w:val="243447"/>
+              </w:rPr>
+              <w:t xml:space="preserve">Read audit activity statistics.</w:t>
             </w:r>
           </w:p>
         </w:tc>
         <w:tc>
           <w:tcPr>
             <w:tcW w:w="1880" w:type="dxa"/>
-            <w:shd w:fill="FFFFFF"/>
-            <w:vAlign w:val="center"/>
-          </w:tcPr>
-          <w:p>
-            <w:pPr>
-              <w:pStyle w:val="TableText"/>
-            </w:pPr>
-            <w:r>
-              <w:rPr>
-                <w:color w:val="243447"/>
-              </w:rPr>
-              <w:t xml:space="preserve">Bearer URL token</w:t>
+            <w:shd w:fill="F6F9FB"/>
+            <w:vAlign w:val="center"/>
+          </w:tcPr>
+          <w:p>
+            <w:pPr>
+              <w:pStyle w:val="TableText"/>
+            </w:pPr>
+            <w:r>
+              <w:rPr>
+                <w:color w:val="243447"/>
+              </w:rPr>
+              <w:t xml:space="preserve">Owner JWT</w:t>
             </w:r>
           </w:p>
         </w:tc>
@@ -6389,6 +6575,1182 @@
               <w:rPr>
                 <w:color w:val="243447"/>
               </w:rPr>
+              <w:t xml:space="preserve">GET /checklist-categories</w:t>
+            </w:r>
+          </w:p>
+        </w:tc>
+        <w:tc>
+          <w:tcPr>
+            <w:tcW w:w="5100" w:type="dxa"/>
+            <w:shd w:fill="F6F9FB"/>
+            <w:vAlign w:val="center"/>
+          </w:tcPr>
+          <w:p>
+            <w:pPr>
+              <w:pStyle w:val="TableText"/>
+            </w:pPr>
+            <w:r>
+              <w:rPr>
+                <w:color w:val="243447"/>
+              </w:rPr>
+              <w:t xml:space="preserve">List active checklist categories.</w:t>
+            </w:r>
+          </w:p>
+        </w:tc>
+        <w:tc>
+          <w:tcPr>
+            <w:tcW w:w="1880" w:type="dxa"/>
+            <w:shd w:fill="F6F9FB"/>
+            <w:vAlign w:val="center"/>
+          </w:tcPr>
+          <w:p>
+            <w:pPr>
+              <w:pStyle w:val="TableText"/>
+            </w:pPr>
+            <w:r>
+              <w:rPr>
+                <w:color w:val="243447"/>
+              </w:rPr>
+              <w:t xml:space="preserve">Office JWT</w:t>
+            </w:r>
+          </w:p>
+        </w:tc>
+      </w:tr>
+      <w:tr>
+        <w:tc>
+          <w:tcPr>
+            <w:tcW w:w="3100" w:type="dxa"/>
+            <w:shd w:fill="F6F9FB"/>
+            <w:vAlign w:val="center"/>
+          </w:tcPr>
+          <w:p>
+            <w:pPr>
+              <w:pStyle w:val="TableText"/>
+            </w:pPr>
+            <w:r>
+              <w:rPr>
+                <w:color w:val="243447"/>
+              </w:rPr>
+              <w:t xml:space="preserve">POST /checklist-categories</w:t>
+            </w:r>
+          </w:p>
+        </w:tc>
+        <w:tc>
+          <w:tcPr>
+            <w:tcW w:w="5100" w:type="dxa"/>
+            <w:shd w:fill="F6F9FB"/>
+            <w:vAlign w:val="center"/>
+          </w:tcPr>
+          <w:p>
+            <w:pPr>
+              <w:pStyle w:val="TableText"/>
+            </w:pPr>
+            <w:r>
+              <w:rPr>
+                <w:color w:val="243447"/>
+              </w:rPr>
+              <w:t xml:space="preserve">Create or reactivate a category.</w:t>
+            </w:r>
+          </w:p>
+        </w:tc>
+        <w:tc>
+          <w:tcPr>
+            <w:tcW w:w="1880" w:type="dxa"/>
+            <w:shd w:fill="F6F9FB"/>
+            <w:vAlign w:val="center"/>
+          </w:tcPr>
+          <w:p>
+            <w:pPr>
+              <w:pStyle w:val="TableText"/>
+            </w:pPr>
+            <w:r>
+              <w:rPr>
+                <w:color w:val="243447"/>
+              </w:rPr>
+              <w:t xml:space="preserve">Office JWT</w:t>
+            </w:r>
+          </w:p>
+        </w:tc>
+      </w:tr>
+      <w:tr>
+        <w:tc>
+          <w:tcPr>
+            <w:tcW w:w="3100" w:type="dxa"/>
+            <w:shd w:fill="F6F9FB"/>
+            <w:vAlign w:val="center"/>
+          </w:tcPr>
+          <w:p>
+            <w:pPr>
+              <w:pStyle w:val="TableText"/>
+            </w:pPr>
+            <w:r>
+              <w:rPr>
+                <w:color w:val="243447"/>
+              </w:rPr>
+              <w:t xml:space="preserve">DELETE /checklist-categories/{category_id}</w:t>
+            </w:r>
+          </w:p>
+        </w:tc>
+        <w:tc>
+          <w:tcPr>
+            <w:tcW w:w="5100" w:type="dxa"/>
+            <w:shd w:fill="F6F9FB"/>
+            <w:vAlign w:val="center"/>
+          </w:tcPr>
+          <w:p>
+            <w:pPr>
+              <w:pStyle w:val="TableText"/>
+            </w:pPr>
+            <w:r>
+              <w:rPr>
+                <w:color w:val="243447"/>
+              </w:rPr>
+              <w:t xml:space="preserve">Archive a category; historical items remain.</w:t>
+            </w:r>
+          </w:p>
+        </w:tc>
+        <w:tc>
+          <w:tcPr>
+            <w:tcW w:w="1880" w:type="dxa"/>
+            <w:shd w:fill="F6F9FB"/>
+            <w:vAlign w:val="center"/>
+          </w:tcPr>
+          <w:p>
+            <w:pPr>
+              <w:pStyle w:val="TableText"/>
+            </w:pPr>
+            <w:r>
+              <w:rPr>
+                <w:color w:val="243447"/>
+              </w:rPr>
+              <w:t xml:space="preserve">Office JWT</w:t>
+            </w:r>
+          </w:p>
+        </w:tc>
+      </w:tr>
+      <w:tr>
+        <w:tc>
+          <w:tcPr>
+            <w:tcW w:w="3100" w:type="dxa"/>
+            <w:shd w:fill="F6F9FB"/>
+            <w:vAlign w:val="center"/>
+          </w:tcPr>
+          <w:p>
+            <w:pPr>
+              <w:pStyle w:val="TableText"/>
+            </w:pPr>
+            <w:r>
+              <w:rPr>
+                <w:color w:val="243447"/>
+              </w:rPr>
+              <w:t xml:space="preserve">POST /work-orders</w:t>
+            </w:r>
+          </w:p>
+        </w:tc>
+        <w:tc>
+          <w:tcPr>
+            <w:tcW w:w="5100" w:type="dxa"/>
+            <w:shd w:fill="F6F9FB"/>
+            <w:vAlign w:val="center"/>
+          </w:tcPr>
+          <w:p>
+            <w:pPr>
+              <w:pStyle w:val="TableText"/>
+            </w:pPr>
+            <w:r>
+              <w:rPr>
+                <w:color w:val="243447"/>
+              </w:rPr>
+              <w:t xml:space="preserve">Create an order and schedule technician notifications.</w:t>
+            </w:r>
+          </w:p>
+        </w:tc>
+        <w:tc>
+          <w:tcPr>
+            <w:tcW w:w="1880" w:type="dxa"/>
+            <w:shd w:fill="F6F9FB"/>
+            <w:vAlign w:val="center"/>
+          </w:tcPr>
+          <w:p>
+            <w:pPr>
+              <w:pStyle w:val="TableText"/>
+            </w:pPr>
+            <w:r>
+              <w:rPr>
+                <w:color w:val="243447"/>
+              </w:rPr>
+              <w:t xml:space="preserve">Office JWT</w:t>
+            </w:r>
+          </w:p>
+        </w:tc>
+      </w:tr>
+      <w:tr>
+        <w:tc>
+          <w:tcPr>
+            <w:tcW w:w="3100" w:type="dxa"/>
+            <w:shd w:fill="F6F9FB"/>
+            <w:vAlign w:val="center"/>
+          </w:tcPr>
+          <w:p>
+            <w:pPr>
+              <w:pStyle w:val="TableText"/>
+            </w:pPr>
+            <w:r>
+              <w:rPr>
+                <w:color w:val="243447"/>
+              </w:rPr>
+              <w:t xml:space="preserve">GET /work-orders</w:t>
+            </w:r>
+          </w:p>
+        </w:tc>
+        <w:tc>
+          <w:tcPr>
+            <w:tcW w:w="5100" w:type="dxa"/>
+            <w:shd w:fill="F6F9FB"/>
+            <w:vAlign w:val="center"/>
+          </w:tcPr>
+          <w:p>
+            <w:pPr>
+              <w:pStyle w:val="TableText"/>
+            </w:pPr>
+            <w:r>
+              <w:rPr>
+                <w:color w:val="243447"/>
+              </w:rPr>
+              <w:t xml:space="preserve">List orders; filters: status, overdue, date range, address, creator.</w:t>
+            </w:r>
+          </w:p>
+        </w:tc>
+        <w:tc>
+          <w:tcPr>
+            <w:tcW w:w="1880" w:type="dxa"/>
+            <w:shd w:fill="F6F9FB"/>
+            <w:vAlign w:val="center"/>
+          </w:tcPr>
+          <w:p>
+            <w:pPr>
+              <w:pStyle w:val="TableText"/>
+            </w:pPr>
+            <w:r>
+              <w:rPr>
+                <w:color w:val="243447"/>
+              </w:rPr>
+              <w:t xml:space="preserve">Office JWT</w:t>
+            </w:r>
+          </w:p>
+        </w:tc>
+      </w:tr>
+      <w:tr>
+        <w:tc>
+          <w:tcPr>
+            <w:tcW w:w="3100" w:type="dxa"/>
+            <w:shd w:fill="F6F9FB"/>
+            <w:vAlign w:val="center"/>
+          </w:tcPr>
+          <w:p>
+            <w:pPr>
+              <w:pStyle w:val="TableText"/>
+            </w:pPr>
+            <w:r>
+              <w:rPr>
+                <w:color w:val="243447"/>
+              </w:rPr>
+              <w:t xml:space="preserve">GET /work-orders/{id}</w:t>
+            </w:r>
+          </w:p>
+        </w:tc>
+        <w:tc>
+          <w:tcPr>
+            <w:tcW w:w="5100" w:type="dxa"/>
+            <w:shd w:fill="F6F9FB"/>
+            <w:vAlign w:val="center"/>
+          </w:tcPr>
+          <w:p>
+            <w:pPr>
+              <w:pStyle w:val="TableText"/>
+            </w:pPr>
+            <w:r>
+              <w:rPr>
+                <w:color w:val="243447"/>
+              </w:rPr>
+              <w:t xml:space="preserve">Read order details.</w:t>
+            </w:r>
+          </w:p>
+        </w:tc>
+        <w:tc>
+          <w:tcPr>
+            <w:tcW w:w="1880" w:type="dxa"/>
+            <w:shd w:fill="F6F9FB"/>
+            <w:vAlign w:val="center"/>
+          </w:tcPr>
+          <w:p>
+            <w:pPr>
+              <w:pStyle w:val="TableText"/>
+            </w:pPr>
+            <w:r>
+              <w:rPr>
+                <w:color w:val="243447"/>
+              </w:rPr>
+              <w:t xml:space="preserve">Office JWT</w:t>
+            </w:r>
+          </w:p>
+        </w:tc>
+      </w:tr>
+      <w:tr>
+        <w:tc>
+          <w:tcPr>
+            <w:tcW w:w="3100" w:type="dxa"/>
+            <w:shd w:fill="F6F9FB"/>
+            <w:vAlign w:val="center"/>
+          </w:tcPr>
+          <w:p>
+            <w:pPr>
+              <w:pStyle w:val="TableText"/>
+            </w:pPr>
+            <w:r>
+              <w:rPr>
+                <w:color w:val="243447"/>
+              </w:rPr>
+              <w:t xml:space="preserve">PATCH /work-orders/{id}</w:t>
+            </w:r>
+          </w:p>
+        </w:tc>
+        <w:tc>
+          <w:tcPr>
+            <w:tcW w:w="5100" w:type="dxa"/>
+            <w:shd w:fill="F6F9FB"/>
+            <w:vAlign w:val="center"/>
+          </w:tcPr>
+          <w:p>
+            <w:pPr>
+              <w:pStyle w:val="TableText"/>
+            </w:pPr>
+            <w:r>
+              <w:rPr>
+                <w:color w:val="243447"/>
+              </w:rPr>
+              <w:t xml:space="preserve">Edit order details while status is assigned.</w:t>
+            </w:r>
+          </w:p>
+        </w:tc>
+        <w:tc>
+          <w:tcPr>
+            <w:tcW w:w="1880" w:type="dxa"/>
+            <w:shd w:fill="F6F9FB"/>
+            <w:vAlign w:val="center"/>
+          </w:tcPr>
+          <w:p>
+            <w:pPr>
+              <w:pStyle w:val="TableText"/>
+            </w:pPr>
+            <w:r>
+              <w:rPr>
+                <w:color w:val="243447"/>
+              </w:rPr>
+              <w:t xml:space="preserve">Office JWT</w:t>
+            </w:r>
+          </w:p>
+        </w:tc>
+      </w:tr>
+      <w:tr>
+        <w:tc>
+          <w:tcPr>
+            <w:tcW w:w="3100" w:type="dxa"/>
+            <w:shd w:fill="F6F9FB"/>
+            <w:vAlign w:val="center"/>
+          </w:tcPr>
+          <w:p>
+            <w:pPr>
+              <w:pStyle w:val="TableText"/>
+            </w:pPr>
+            <w:r>
+              <w:rPr>
+                <w:color w:val="243447"/>
+              </w:rPr>
+              <w:t xml:space="preserve">DELETE /work-orders/{id}</w:t>
+            </w:r>
+          </w:p>
+        </w:tc>
+        <w:tc>
+          <w:tcPr>
+            <w:tcW w:w="5100" w:type="dxa"/>
+            <w:shd w:fill="F6F9FB"/>
+            <w:vAlign w:val="center"/>
+          </w:tcPr>
+          <w:p>
+            <w:pPr>
+              <w:pStyle w:val="TableText"/>
+            </w:pPr>
+            <w:r>
+              <w:rPr>
+                <w:color w:val="243447"/>
+              </w:rPr>
+              <w:t xml:space="preserve">Delete order and stored assets; signed-off deletion is Owner-only.</w:t>
+            </w:r>
+          </w:p>
+        </w:tc>
+        <w:tc>
+          <w:tcPr>
+            <w:tcW w:w="1880" w:type="dxa"/>
+            <w:shd w:fill="F6F9FB"/>
+            <w:vAlign w:val="center"/>
+          </w:tcPr>
+          <w:p>
+            <w:pPr>
+              <w:pStyle w:val="TableText"/>
+            </w:pPr>
+            <w:r>
+              <w:rPr>
+                <w:color w:val="243447"/>
+              </w:rPr>
+              <w:t xml:space="preserve">Office JWT</w:t>
+            </w:r>
+          </w:p>
+        </w:tc>
+      </w:tr>
+      <w:tr>
+        <w:tc>
+          <w:tcPr>
+            <w:tcW w:w="3100" w:type="dxa"/>
+            <w:shd w:fill="F6F9FB"/>
+            <w:vAlign w:val="center"/>
+          </w:tcPr>
+          <w:p>
+            <w:pPr>
+              <w:pStyle w:val="TableText"/>
+            </w:pPr>
+            <w:r>
+              <w:rPr>
+                <w:color w:val="243447"/>
+              </w:rPr>
+              <w:t xml:space="preserve">GET /work-orders/{id}/pdf</w:t>
+            </w:r>
+          </w:p>
+        </w:tc>
+        <w:tc>
+          <w:tcPr>
+            <w:tcW w:w="5100" w:type="dxa"/>
+            <w:shd w:fill="F6F9FB"/>
+            <w:vAlign w:val="center"/>
+          </w:tcPr>
+          <w:p>
+            <w:pPr>
+              <w:pStyle w:val="TableText"/>
+            </w:pPr>
+            <w:r>
+              <w:rPr>
+                <w:color w:val="243447"/>
+              </w:rPr>
+              <w:t xml:space="preserve">Download the current work-order PDF.</w:t>
+            </w:r>
+          </w:p>
+        </w:tc>
+        <w:tc>
+          <w:tcPr>
+            <w:tcW w:w="1880" w:type="dxa"/>
+            <w:shd w:fill="F6F9FB"/>
+            <w:vAlign w:val="center"/>
+          </w:tcPr>
+          <w:p>
+            <w:pPr>
+              <w:pStyle w:val="TableText"/>
+            </w:pPr>
+            <w:r>
+              <w:rPr>
+                <w:color w:val="243447"/>
+              </w:rPr>
+              <w:t xml:space="preserve">Office JWT</w:t>
+            </w:r>
+          </w:p>
+        </w:tc>
+      </w:tr>
+      <w:tr>
+        <w:tc>
+          <w:tcPr>
+            <w:tcW w:w="3100" w:type="dxa"/>
+            <w:shd w:fill="F6F9FB"/>
+            <w:vAlign w:val="center"/>
+          </w:tcPr>
+          <w:p>
+            <w:pPr>
+              <w:pStyle w:val="TableText"/>
+            </w:pPr>
+            <w:r>
+              <w:rPr>
+                <w:color w:val="243447"/>
+              </w:rPr>
+              <w:t xml:space="preserve">POST /work-orders/{id}/resend</w:t>
+            </w:r>
+          </w:p>
+        </w:tc>
+        <w:tc>
+          <w:tcPr>
+            <w:tcW w:w="5100" w:type="dxa"/>
+            <w:shd w:fill="F6F9FB"/>
+            <w:vAlign w:val="center"/>
+          </w:tcPr>
+          <w:p>
+            <w:pPr>
+              <w:pStyle w:val="TableText"/>
+            </w:pPr>
+            <w:r>
+              <w:rPr>
+                <w:color w:val="243447"/>
+              </w:rPr>
+              <w:t xml:space="preserve">Resend the technician SMS when configured.</w:t>
+            </w:r>
+          </w:p>
+        </w:tc>
+        <w:tc>
+          <w:tcPr>
+            <w:tcW w:w="1880" w:type="dxa"/>
+            <w:shd w:fill="F6F9FB"/>
+            <w:vAlign w:val="center"/>
+          </w:tcPr>
+          <w:p>
+            <w:pPr>
+              <w:pStyle w:val="TableText"/>
+            </w:pPr>
+            <w:r>
+              <w:rPr>
+                <w:color w:val="243447"/>
+              </w:rPr>
+              <w:t xml:space="preserve">Office JWT</w:t>
+            </w:r>
+          </w:p>
+        </w:tc>
+      </w:tr>
+      <w:tr>
+        <w:tc>
+          <w:tcPr>
+            <w:tcW w:w="3100" w:type="dxa"/>
+            <w:shd w:fill="F6F9FB"/>
+            <w:vAlign w:val="center"/>
+          </w:tcPr>
+          <w:p>
+            <w:pPr>
+              <w:pStyle w:val="TableText"/>
+            </w:pPr>
+            <w:r>
+              <w:rPr>
+                <w:color w:val="243447"/>
+              </w:rPr>
+              <w:t xml:space="preserve">POST /work-orders/{id}/regenerate-link</w:t>
+            </w:r>
+          </w:p>
+        </w:tc>
+        <w:tc>
+          <w:tcPr>
+            <w:tcW w:w="5100" w:type="dxa"/>
+            <w:shd w:fill="F6F9FB"/>
+            <w:vAlign w:val="center"/>
+          </w:tcPr>
+          <w:p>
+            <w:pPr>
+              <w:pStyle w:val="TableText"/>
+            </w:pPr>
+            <w:r>
+              <w:rPr>
+                <w:color w:val="243447"/>
+              </w:rPr>
+              <w:t xml:space="preserve">Rotate the worker token; the previous link stops working.</w:t>
+            </w:r>
+          </w:p>
+        </w:tc>
+        <w:tc>
+          <w:tcPr>
+            <w:tcW w:w="1880" w:type="dxa"/>
+            <w:shd w:fill="F6F9FB"/>
+            <w:vAlign w:val="center"/>
+          </w:tcPr>
+          <w:p>
+            <w:pPr>
+              <w:pStyle w:val="TableText"/>
+            </w:pPr>
+            <w:r>
+              <w:rPr>
+                <w:color w:val="243447"/>
+              </w:rPr>
+              <w:t xml:space="preserve">Office JWT</w:t>
+            </w:r>
+          </w:p>
+        </w:tc>
+      </w:tr>
+      <w:tr>
+        <w:tc>
+          <w:tcPr>
+            <w:tcW w:w="3100" w:type="dxa"/>
+            <w:shd w:fill="F6F9FB"/>
+            <w:vAlign w:val="center"/>
+          </w:tcPr>
+          <w:p>
+            <w:pPr>
+              <w:pStyle w:val="TableText"/>
+            </w:pPr>
+            <w:r>
+              <w:rPr>
+                <w:color w:val="243447"/>
+              </w:rPr>
+              <w:t xml:space="preserve">POST /work-orders/{id}/send-email</w:t>
+            </w:r>
+          </w:p>
+        </w:tc>
+        <w:tc>
+          <w:tcPr>
+            <w:tcW w:w="5100" w:type="dxa"/>
+            <w:shd w:fill="F6F9FB"/>
+            <w:vAlign w:val="center"/>
+          </w:tcPr>
+          <w:p>
+            <w:pPr>
+              <w:pStyle w:val="TableText"/>
+            </w:pPr>
+            <w:r>
+              <w:rPr>
+                <w:color w:val="243447"/>
+              </w:rPr>
+              <w:t xml:space="preserve">Resend a finalized report; optional to_email override.</w:t>
+            </w:r>
+          </w:p>
+        </w:tc>
+        <w:tc>
+          <w:tcPr>
+            <w:tcW w:w="1880" w:type="dxa"/>
+            <w:shd w:fill="F6F9FB"/>
+            <w:vAlign w:val="center"/>
+          </w:tcPr>
+          <w:p>
+            <w:pPr>
+              <w:pStyle w:val="TableText"/>
+            </w:pPr>
+            <w:r>
+              <w:rPr>
+                <w:color w:val="243447"/>
+              </w:rPr>
+              <w:t xml:space="preserve">Office JWT</w:t>
+            </w:r>
+          </w:p>
+        </w:tc>
+      </w:tr>
+      <w:tr>
+        <w:tc>
+          <w:tcPr>
+            <w:tcW w:w="3100" w:type="dxa"/>
+            <w:shd w:fill="F6F9FB"/>
+            <w:vAlign w:val="center"/>
+          </w:tcPr>
+          <w:p>
+            <w:pPr>
+              <w:pStyle w:val="TableText"/>
+            </w:pPr>
+            <w:r>
+              <w:rPr>
+                <w:color w:val="243447"/>
+              </w:rPr>
+              <w:t xml:space="preserve">GET /wo/{token}</w:t>
+            </w:r>
+          </w:p>
+        </w:tc>
+        <w:tc>
+          <w:tcPr>
+            <w:tcW w:w="5100" w:type="dxa"/>
+            <w:shd w:fill="F6F9FB"/>
+            <w:vAlign w:val="center"/>
+          </w:tcPr>
+          <w:p>
+            <w:pPr>
+              <w:pStyle w:val="TableText"/>
+            </w:pPr>
+            <w:r>
+              <w:rPr>
+                <w:color w:val="243447"/>
+              </w:rPr>
+              <w:t xml:space="preserve">Read the worker-safe order view.</w:t>
+            </w:r>
+          </w:p>
+        </w:tc>
+        <w:tc>
+          <w:tcPr>
+            <w:tcW w:w="1880" w:type="dxa"/>
+            <w:shd w:fill="F6F9FB"/>
+            <w:vAlign w:val="center"/>
+          </w:tcPr>
+          <w:p>
+            <w:pPr>
+              <w:pStyle w:val="TableText"/>
+            </w:pPr>
+            <w:r>
+              <w:rPr>
+                <w:color w:val="243447"/>
+              </w:rPr>
+              <w:t xml:space="preserve">Capability URL</w:t>
+            </w:r>
+          </w:p>
+        </w:tc>
+      </w:tr>
+      <w:tr>
+        <w:tc>
+          <w:tcPr>
+            <w:tcW w:w="3100" w:type="dxa"/>
+            <w:shd w:fill="F6F9FB"/>
+            <w:vAlign w:val="center"/>
+          </w:tcPr>
+          <w:p>
+            <w:pPr>
+              <w:pStyle w:val="TableText"/>
+            </w:pPr>
+            <w:r>
+              <w:rPr>
+                <w:color w:val="243447"/>
+              </w:rPr>
+              <w:t xml:space="preserve">POST /wo/{token}/start</w:t>
+            </w:r>
+          </w:p>
+        </w:tc>
+        <w:tc>
+          <w:tcPr>
+            <w:tcW w:w="5100" w:type="dxa"/>
+            <w:shd w:fill="F6F9FB"/>
+            <w:vAlign w:val="center"/>
+          </w:tcPr>
+          <w:p>
+            <w:pPr>
+              <w:pStyle w:val="TableText"/>
+            </w:pPr>
+            <w:r>
+              <w:rPr>
+                <w:color w:val="243447"/>
+              </w:rPr>
+              <w:t xml:space="preserve">Start assigned work.</w:t>
+            </w:r>
+          </w:p>
+        </w:tc>
+        <w:tc>
+          <w:tcPr>
+            <w:tcW w:w="1880" w:type="dxa"/>
+            <w:shd w:fill="F6F9FB"/>
+            <w:vAlign w:val="center"/>
+          </w:tcPr>
+          <w:p>
+            <w:pPr>
+              <w:pStyle w:val="TableText"/>
+            </w:pPr>
+            <w:r>
+              <w:rPr>
+                <w:color w:val="243447"/>
+              </w:rPr>
+              <w:t xml:space="preserve">Capability URL</w:t>
+            </w:r>
+          </w:p>
+        </w:tc>
+      </w:tr>
+      <w:tr>
+        <w:tc>
+          <w:tcPr>
+            <w:tcW w:w="3100" w:type="dxa"/>
+            <w:shd w:fill="F6F9FB"/>
+            <w:vAlign w:val="center"/>
+          </w:tcPr>
+          <w:p>
+            <w:pPr>
+              <w:pStyle w:val="TableText"/>
+            </w:pPr>
+            <w:r>
+              <w:rPr>
+                <w:color w:val="243447"/>
+              </w:rPr>
+              <w:t xml:space="preserve">PATCH /wo/{token}/items/{item_id}</w:t>
+            </w:r>
+          </w:p>
+        </w:tc>
+        <w:tc>
+          <w:tcPr>
+            <w:tcW w:w="5100" w:type="dxa"/>
+            <w:shd w:fill="F6F9FB"/>
+            <w:vAlign w:val="center"/>
+          </w:tcPr>
+          <w:p>
+            <w:pPr>
+              <w:pStyle w:val="TableText"/>
+            </w:pPr>
+            <w:r>
+              <w:rPr>
+                <w:color w:val="243447"/>
+              </w:rPr>
+              <w:t xml:space="preserve">Update task notes, resolution, category, or photo-skip flags.</w:t>
+            </w:r>
+          </w:p>
+        </w:tc>
+        <w:tc>
+          <w:tcPr>
+            <w:tcW w:w="1880" w:type="dxa"/>
+            <w:shd w:fill="F6F9FB"/>
+            <w:vAlign w:val="center"/>
+          </w:tcPr>
+          <w:p>
+            <w:pPr>
+              <w:pStyle w:val="TableText"/>
+            </w:pPr>
+            <w:r>
+              <w:rPr>
+                <w:color w:val="243447"/>
+              </w:rPr>
+              <w:t xml:space="preserve">Capability URL</w:t>
+            </w:r>
+          </w:p>
+        </w:tc>
+      </w:tr>
+      <w:tr>
+        <w:tc>
+          <w:tcPr>
+            <w:tcW w:w="3100" w:type="dxa"/>
+            <w:shd w:fill="F6F9FB"/>
+            <w:vAlign w:val="center"/>
+          </w:tcPr>
+          <w:p>
+            <w:pPr>
+              <w:pStyle w:val="TableText"/>
+            </w:pPr>
+            <w:r>
+              <w:rPr>
+                <w:color w:val="243447"/>
+              </w:rPr>
+              <w:t xml:space="preserve">POST /wo/{token}/items/{item_id}/photo?slot=before|after</w:t>
+            </w:r>
+          </w:p>
+        </w:tc>
+        <w:tc>
+          <w:tcPr>
+            <w:tcW w:w="5100" w:type="dxa"/>
+            <w:shd w:fill="F6F9FB"/>
+            <w:vAlign w:val="center"/>
+          </w:tcPr>
+          <w:p>
+            <w:pPr>
+              <w:pStyle w:val="TableText"/>
+            </w:pPr>
+            <w:r>
+              <w:rPr>
+                <w:color w:val="243447"/>
+              </w:rPr>
+              <w:t xml:space="preserve">Upload a PNG, JPEG, or WEBP photo within MAX_UPLOAD_MB.</w:t>
+            </w:r>
+          </w:p>
+        </w:tc>
+        <w:tc>
+          <w:tcPr>
+            <w:tcW w:w="1880" w:type="dxa"/>
+            <w:shd w:fill="F6F9FB"/>
+            <w:vAlign w:val="center"/>
+          </w:tcPr>
+          <w:p>
+            <w:pPr>
+              <w:pStyle w:val="TableText"/>
+            </w:pPr>
+            <w:r>
+              <w:rPr>
+                <w:color w:val="243447"/>
+              </w:rPr>
+              <w:t xml:space="preserve">Capability URL</w:t>
+            </w:r>
+          </w:p>
+        </w:tc>
+      </w:tr>
+      <w:tr>
+        <w:tc>
+          <w:tcPr>
+            <w:tcW w:w="3100" w:type="dxa"/>
+            <w:shd w:fill="F6F9FB"/>
+            <w:vAlign w:val="center"/>
+          </w:tcPr>
+          <w:p>
+            <w:pPr>
+              <w:pStyle w:val="TableText"/>
+            </w:pPr>
+            <w:r>
+              <w:rPr>
+                <w:color w:val="243447"/>
+              </w:rPr>
+              <w:t xml:space="preserve">DELETE /wo/{token}/items/{item_id}/photo?slot=before|after</w:t>
+            </w:r>
+          </w:p>
+        </w:tc>
+        <w:tc>
+          <w:tcPr>
+            <w:tcW w:w="5100" w:type="dxa"/>
+            <w:shd w:fill="F6F9FB"/>
+            <w:vAlign w:val="center"/>
+          </w:tcPr>
+          <w:p>
+            <w:pPr>
+              <w:pStyle w:val="TableText"/>
+            </w:pPr>
+            <w:r>
+              <w:rPr>
+                <w:color w:val="243447"/>
+              </w:rPr>
+              <w:t xml:space="preserve">Remove a before or after photo.</w:t>
+            </w:r>
+          </w:p>
+        </w:tc>
+        <w:tc>
+          <w:tcPr>
+            <w:tcW w:w="1880" w:type="dxa"/>
+            <w:shd w:fill="F6F9FB"/>
+            <w:vAlign w:val="center"/>
+          </w:tcPr>
+          <w:p>
+            <w:pPr>
+              <w:pStyle w:val="TableText"/>
+            </w:pPr>
+            <w:r>
+              <w:rPr>
+                <w:color w:val="243447"/>
+              </w:rPr>
+              <w:t xml:space="preserve">Capability URL</w:t>
+            </w:r>
+          </w:p>
+        </w:tc>
+      </w:tr>
+      <w:tr>
+        <w:tc>
+          <w:tcPr>
+            <w:tcW w:w="3100" w:type="dxa"/>
+            <w:shd w:fill="F6F9FB"/>
+            <w:vAlign w:val="center"/>
+          </w:tcPr>
+          <w:p>
+            <w:pPr>
+              <w:pStyle w:val="TableText"/>
+            </w:pPr>
+            <w:r>
+              <w:rPr>
+                <w:color w:val="243447"/>
+              </w:rPr>
+              <w:t xml:space="preserve">POST /wo/{token}/progress</w:t>
+            </w:r>
+          </w:p>
+        </w:tc>
+        <w:tc>
+          <w:tcPr>
+            <w:tcW w:w="5100" w:type="dxa"/>
+            <w:shd w:fill="F6F9FB"/>
+            <w:vAlign w:val="center"/>
+          </w:tcPr>
+          <w:p>
+            <w:pPr>
+              <w:pStyle w:val="TableText"/>
+            </w:pPr>
+            <w:r>
+              <w:rPr>
+                <w:color w:val="243447"/>
+              </w:rPr>
+              <w:t xml:space="preserve">Save inspection progress without completing the job.</w:t>
+            </w:r>
+          </w:p>
+        </w:tc>
+        <w:tc>
+          <w:tcPr>
+            <w:tcW w:w="1880" w:type="dxa"/>
+            <w:shd w:fill="F6F9FB"/>
+            <w:vAlign w:val="center"/>
+          </w:tcPr>
+          <w:p>
+            <w:pPr>
+              <w:pStyle w:val="TableText"/>
+            </w:pPr>
+            <w:r>
+              <w:rPr>
+                <w:color w:val="243447"/>
+              </w:rPr>
+              <w:t xml:space="preserve">Capability URL</w:t>
+            </w:r>
+          </w:p>
+        </w:tc>
+      </w:tr>
+      <w:tr>
+        <w:tc>
+          <w:tcPr>
+            <w:tcW w:w="3100" w:type="dxa"/>
+            <w:shd w:fill="F6F9FB"/>
+            <w:vAlign w:val="center"/>
+          </w:tcPr>
+          <w:p>
+            <w:pPr>
+              <w:pStyle w:val="TableText"/>
+            </w:pPr>
+            <w:r>
+              <w:rPr>
+                <w:color w:val="243447"/>
+              </w:rPr>
+              <w:t xml:space="preserve">POST /wo/{token}/complete</w:t>
+            </w:r>
+          </w:p>
+        </w:tc>
+        <w:tc>
+          <w:tcPr>
+            <w:tcW w:w="5100" w:type="dxa"/>
+            <w:shd w:fill="F6F9FB"/>
+            <w:vAlign w:val="center"/>
+          </w:tcPr>
+          <w:p>
+            <w:pPr>
+              <w:pStyle w:val="TableText"/>
+            </w:pPr>
+            <w:r>
+              <w:rPr>
+                <w:color w:val="243447"/>
+              </w:rPr>
+              <w:t xml:space="preserve">Validate requirements and submit work for sign-off.</w:t>
+            </w:r>
+          </w:p>
+        </w:tc>
+        <w:tc>
+          <w:tcPr>
+            <w:tcW w:w="1880" w:type="dxa"/>
+            <w:shd w:fill="F6F9FB"/>
+            <w:vAlign w:val="center"/>
+          </w:tcPr>
+          <w:p>
+            <w:pPr>
+              <w:pStyle w:val="TableText"/>
+            </w:pPr>
+            <w:r>
+              <w:rPr>
+                <w:color w:val="243447"/>
+              </w:rPr>
+              <w:t xml:space="preserve">Capability URL</w:t>
+            </w:r>
+          </w:p>
+        </w:tc>
+      </w:tr>
+      <w:tr>
+        <w:tc>
+          <w:tcPr>
+            <w:tcW w:w="3100" w:type="dxa"/>
+            <w:shd w:fill="F6F9FB"/>
+            <w:vAlign w:val="center"/>
+          </w:tcPr>
+          <w:p>
+            <w:pPr>
+              <w:pStyle w:val="TableText"/>
+            </w:pPr>
+            <w:r>
+              <w:rPr>
+                <w:color w:val="243447"/>
+              </w:rPr>
+              <w:t xml:space="preserve">POST /wo/{token}/sign</w:t>
+            </w:r>
+          </w:p>
+        </w:tc>
+        <w:tc>
+          <w:tcPr>
+            <w:tcW w:w="5100" w:type="dxa"/>
+            <w:shd w:fill="F6F9FB"/>
+            <w:vAlign w:val="center"/>
+          </w:tcPr>
+          <w:p>
+            <w:pPr>
+              <w:pStyle w:val="TableText"/>
+            </w:pPr>
+            <w:r>
+              <w:rPr>
+                <w:color w:val="243447"/>
+              </w:rPr>
+              <w:t xml:space="preserve">Save tenant or technician signature; technician signs second.</w:t>
+            </w:r>
+          </w:p>
+        </w:tc>
+        <w:tc>
+          <w:tcPr>
+            <w:tcW w:w="1880" w:type="dxa"/>
+            <w:shd w:fill="F6F9FB"/>
+            <w:vAlign w:val="center"/>
+          </w:tcPr>
+          <w:p>
+            <w:pPr>
+              <w:pStyle w:val="TableText"/>
+            </w:pPr>
+            <w:r>
+              <w:rPr>
+                <w:color w:val="243447"/>
+              </w:rPr>
+              <w:t xml:space="preserve">Capability URL</w:t>
+            </w:r>
+          </w:p>
+        </w:tc>
+      </w:tr>
+      <w:tr>
+        <w:tc>
+          <w:tcPr>
+            <w:tcW w:w="3100" w:type="dxa"/>
+            <w:shd w:fill="F6F9FB"/>
+            <w:vAlign w:val="center"/>
+          </w:tcPr>
+          <w:p>
+            <w:pPr>
+              <w:pStyle w:val="TableText"/>
+            </w:pPr>
+            <w:r>
+              <w:rPr>
+                <w:color w:val="243447"/>
+              </w:rPr>
+              <w:t xml:space="preserve">GET /wo/{token}/pdf</w:t>
+            </w:r>
+          </w:p>
+        </w:tc>
+        <w:tc>
+          <w:tcPr>
+            <w:tcW w:w="5100" w:type="dxa"/>
+            <w:shd w:fill="F6F9FB"/>
+            <w:vAlign w:val="center"/>
+          </w:tcPr>
+          <w:p>
+            <w:pPr>
+              <w:pStyle w:val="TableText"/>
+            </w:pPr>
+            <w:r>
+              <w:rPr>
+                <w:color w:val="243447"/>
+              </w:rPr>
+              <w:t xml:space="preserve">Download the work-order PDF.</w:t>
+            </w:r>
+          </w:p>
+        </w:tc>
+        <w:tc>
+          <w:tcPr>
+            <w:tcW w:w="1880" w:type="dxa"/>
+            <w:shd w:fill="F6F9FB"/>
+            <w:vAlign w:val="center"/>
+          </w:tcPr>
+          <w:p>
+            <w:pPr>
+              <w:pStyle w:val="TableText"/>
+            </w:pPr>
+            <w:r>
+              <w:rPr>
+                <w:color w:val="243447"/>
+              </w:rPr>
+              <w:t xml:space="preserve">Capability URL</w:t>
+            </w:r>
+          </w:p>
+        </w:tc>
+      </w:tr>
+      <w:tr>
+        <w:tc>
+          <w:tcPr>
+            <w:tcW w:w="3100" w:type="dxa"/>
+            <w:shd w:fill="F6F9FB"/>
+            <w:vAlign w:val="center"/>
+          </w:tcPr>
+          <w:p>
+            <w:pPr>
+              <w:pStyle w:val="TableText"/>
+            </w:pPr>
+            <w:r>
+              <w:rPr>
+                <w:color w:val="243447"/>
+              </w:rPr>
               <w:t xml:space="preserve">GET /health</w:t>
             </w:r>
           </w:p>
@@ -6407,7 +7769,7 @@
               <w:rPr>
                 <w:color w:val="243447"/>
               </w:rPr>
-              <w:t xml:space="preserve">Liveness response</w:t>
+              <w:t xml:space="preserve">Return API liveness status.</w:t>
             </w:r>
           </w:p>
         </w:tc>
@@ -6434,54 +7796,54 @@
         <w:tc>
           <w:tcPr>
             <w:tcW w:w="3100" w:type="dxa"/>
-            <w:shd w:fill="FFFFFF"/>
-            <w:vAlign w:val="center"/>
-          </w:tcPr>
-          <w:p>
-            <w:pPr>
-              <w:pStyle w:val="TableText"/>
-            </w:pPr>
-            <w:r>
-              <w:rPr>
-                <w:color w:val="243447"/>
-              </w:rPr>
-              <w:t xml:space="preserve">/files/*</w:t>
+            <w:shd w:fill="F6F9FB"/>
+            <w:vAlign w:val="center"/>
+          </w:tcPr>
+          <w:p>
+            <w:pPr>
+              <w:pStyle w:val="TableText"/>
+            </w:pPr>
+            <w:r>
+              <w:rPr>
+                <w:color w:val="243447"/>
+              </w:rPr>
+              <w:t xml:space="preserve">GET /files/*</w:t>
             </w:r>
           </w:p>
         </w:tc>
         <w:tc>
           <w:tcPr>
             <w:tcW w:w="5100" w:type="dxa"/>
-            <w:shd w:fill="FFFFFF"/>
-            <w:vAlign w:val="center"/>
-          </w:tcPr>
-          <w:p>
-            <w:pPr>
-              <w:pStyle w:val="TableText"/>
-            </w:pPr>
-            <w:r>
-              <w:rPr>
-                <w:color w:val="243447"/>
-              </w:rPr>
-              <w:t xml:space="preserve">Local static work-order files</w:t>
+            <w:shd w:fill="F6F9FB"/>
+            <w:vAlign w:val="center"/>
+          </w:tcPr>
+          <w:p>
+            <w:pPr>
+              <w:pStyle w:val="TableText"/>
+            </w:pPr>
+            <w:r>
+              <w:rPr>
+                <w:color w:val="243447"/>
+              </w:rPr>
+              <w:t xml:space="preserve">Serve local stored files; S3 mode redirects to a storage download URL.</w:t>
             </w:r>
           </w:p>
         </w:tc>
         <w:tc>
           <w:tcPr>
             <w:tcW w:w="1880" w:type="dxa"/>
-            <w:shd w:fill="FFFFFF"/>
-            <w:vAlign w:val="center"/>
-          </w:tcPr>
-          <w:p>
-            <w:pPr>
-              <w:pStyle w:val="TableText"/>
-            </w:pPr>
-            <w:r>
-              <w:rPr>
-                <w:color w:val="243447"/>
-              </w:rPr>
-              <w:t xml:space="preserve">No office-account JWT on local StaticFiles path; URL possession may expose asset</w:t>
+            <w:shd w:fill="F6F9FB"/>
+            <w:vAlign w:val="center"/>
+          </w:tcPr>
+          <w:p>
+            <w:pPr>
+              <w:pStyle w:val="TableText"/>
+            </w:pPr>
+            <w:r>
+              <w:rPr>
+                <w:color w:val="243447"/>
+              </w:rPr>
+              <w:t xml:space="preserve">Asset URL; local files are not office-JWT protected</w:t>
             </w:r>
           </w:p>
         </w:tc>
@@ -8313,6 +9675,62 @@
                 <w:color w:val="243447"/>
               </w:rPr>
               <w:t xml:space="preserve">Rebuilt after role cleanup; documented Owner/Admin roles, legacy role migration, and corrected developer/client attribution. Developer contacts are Muhammad Attayab Ashraf / Automivex only; client identified as ReadyRentalsOnline.</w:t>
+            </w:r>
+          </w:p>
+        </w:tc>
+      </w:tr>
+      <w:tr>
+        <w:tc>
+          <w:tcPr>
+            <w:tcW w:w="1200" w:type="dxa"/>
+            <w:shd w:fill="F6F9FB"/>
+            <w:vAlign w:val="center"/>
+          </w:tcPr>
+          <w:p>
+            <w:pPr>
+              <w:pStyle w:val="TableText"/>
+            </w:pPr>
+            <w:r>
+              <w:rPr>
+                <w:color w:val="243447"/>
+              </w:rPr>
+              <w:t xml:space="preserve">1.2</w:t>
+            </w:r>
+          </w:p>
+        </w:tc>
+        <w:tc>
+          <w:tcPr>
+            <w:tcW w:w="1800" w:type="dxa"/>
+            <w:shd w:fill="F6F9FB"/>
+            <w:vAlign w:val="center"/>
+          </w:tcPr>
+          <w:p>
+            <w:pPr>
+              <w:pStyle w:val="TableText"/>
+            </w:pPr>
+            <w:r>
+              <w:rPr>
+                <w:color w:val="243447"/>
+              </w:rPr>
+              <w:t xml:space="preserve">24 Sep 2026</w:t>
+            </w:r>
+          </w:p>
+        </w:tc>
+        <w:tc>
+          <w:tcPr>
+            <w:tcW w:w="7080" w:type="dxa"/>
+            <w:shd w:fill="F6F9FB"/>
+            <w:vAlign w:val="center"/>
+          </w:tcPr>
+          <w:p>
+            <w:pPr>
+              <w:pStyle w:val="TableText"/>
+            </w:pPr>
+            <w:r>
+              <w:rPr>
+                <w:color w:val="243447"/>
+              </w:rPr>
+              <w:t xml:space="preserve">Refreshed diagrams, documented current four-state lifecycle and SLA targets, expanded API route reference, and updated technician email/SMS behavior and deployment details.</w:t>
             </w:r>
           </w:p>
         </w:tc>

</xml_diff>